<commit_message>
Added granular detail and images
</commit_message>
<xml_diff>
--- a/docs/technical documentation/Apex BPO Operations & Workforce Productivity Analytics Documentation.docx
+++ b/docs/technical documentation/Apex BPO Operations & Workforce Productivity Analytics Documentation.docx
@@ -5385,7 +5385,7 @@
           <w:highlight w:val="none"/>
           <w:lang w:val="en-PH"/>
         </w:rPr>
-        <w:t xml:space="preserve">Agent Utilization Rate (%):</w:t>
+        <w:t xml:space="preserve">Agent Utilization Rate:</w:t>
       </w:r>
       <w:r>
         <w:rPr>
@@ -5518,17 +5518,6 @@
               </m:nary>
             </m:den>
           </m:f>
-          <m:r>
-            <w:rPr>
-              <w:rFonts w:hint="default" w:ascii="Cambria Math" w:hAnsi="Cambria Math" w:eastAsia="Cambria Math" w:cs="Cambria Math"/>
-              <w:highlight w:val="none"/>
-              <w:lang w:val="en-PH" w:bidi="en-PH"/>
-            </w:rPr>
-            <m:rPr>
-              <m:sty m:val="i"/>
-            </m:rPr>
-            <m:t>×100</m:t>
-          </m:r>
         </m:oMath>
       </m:oMathPara>
       <w:r>
@@ -5571,7 +5560,7 @@
           <w:highlight w:val="none"/>
           <w:lang w:val="en-PH"/>
         </w:rPr>
-        <w:t xml:space="preserve">Service Level Agreement (SLA) Compliance (%):</w:t>
+        <w:t xml:space="preserve">Service Level Agreement (SLA) Compliance:</w:t>
       </w:r>
       <w:r>
         <w:rPr>
@@ -5670,17 +5659,6 @@
               </m:r>
             </m:den>
           </m:f>
-          <m:r>
-            <w:rPr>
-              <w:rFonts w:hint="default" w:ascii="Cambria Math" w:hAnsi="Cambria Math" w:eastAsia="Cambria Math" w:cs="Cambria Math"/>
-              <w:highlight w:val="none"/>
-              <w:lang w:val="en-PH" w:bidi="en-PH"/>
-            </w:rPr>
-            <m:rPr>
-              <m:sty m:val="i"/>
-            </m:rPr>
-            <m:t>×100</m:t>
-          </m:r>
         </m:oMath>
       </m:oMathPara>
       <w:r>
@@ -5727,7 +5705,7 @@
           <w:highlight w:val="none"/>
           <w:lang w:val="en-PH"/>
         </w:rPr>
-        <w:t xml:space="preserve">Abandonment Rate (%):</w:t>
+        <w:t xml:space="preserve">Abandonment Rate:</w:t>
       </w:r>
       <w:r>
         <w:rPr>
@@ -5818,17 +5796,6 @@
               </m:r>
             </m:den>
           </m:f>
-          <m:r>
-            <w:rPr>
-              <w:rFonts w:hint="default" w:ascii="Cambria Math" w:hAnsi="Cambria Math" w:eastAsia="Cambria Math" w:cs="Cambria Math"/>
-              <w:highlight w:val="none"/>
-              <w:lang w:val="en-PH" w:bidi="en-PH"/>
-            </w:rPr>
-            <m:rPr>
-              <m:sty m:val="i"/>
-            </m:rPr>
-            <m:t>×100</m:t>
-          </m:r>
         </m:oMath>
       </m:oMathPara>
       <w:r>

</xml_diff>